<commit_message>
chore: perform word backup and save final visual admin state
</commit_message>
<xml_diff>
--- a/גיבוי וורד - MechLex_Visual_Admin_Fork/README_HE.txt.docx
+++ b/גיבוי וורד - MechLex_Visual_Admin_Fork/README_HE.txt.docx
@@ -33,7 +33,7 @@
 - תצוגת מושגים הכוללת הגדרה מקצועית, תמונה, נוסחה, משתנים, תקנים, שימושים,
   שיקולי ייצור, שיטות בחינה, דוגמאות ומושגים קשורים.
 - מועדפים, מצב למידה והיסטוריית צפייה לכל משתמש במחשב ובדפדפן שלו.
-- ניהול תוכן והרשאת אדמין ראשי בשתי דרגות גישה נפרדות.
+- ניהול תוכן והרשאת אדמין חזותית מובנית בממשק, ללא צורך בסיסמאות.
 - עבודה ללא אינטרנט וללא שירות ענן.
 סביבת העבודה המיועדת
 ---------------------
@@ -170,61 +170,39 @@
 - לעבור בין מצב בהיר לכהה.
 הרשאות ומרכז הניהול
 -------------------
-הכניסה נעשית דרך הכפתור "מרכז ניהול" ובחירת דרגת הרשאה.
-קודי ברירת המחדל בחבילה חדשה:
-- מומחה תוכן / Content Admin: 1234
-- אדמין ראשי / Super Admin: 9999
-יש לשנות קודים אלה לאחר ההתקנה. הקודים נשמרים בדפדפן המקומי בלבד, אינם נכללים
-בגיבויי JSON ומשמשים מחסום נוחות — לא מנגנון אבטחה ארגוני.
-מומחה תוכן — Content Admin
---------------------------
-מומחה התוכן מיועד לעבודה השוטפת על הקטלוג. הוא יכול:
+הגישה למצב עריכה פתוחה לכל משתמש בארגון שרץ על התיקייה המשותפת.
+אין צורך בהזנת קוד (PIN) כדי לערוך את המילון. 
+שלבי עריכה:
+1. לחצו על הכפתור "מעבר למצב עריכה" (או על כפתור ⚙️) בתפריט הראשי.
+2. אשרו את אזהרת העריכה הקופצת שמבהירה כי השינויים יהיו גלויים לכל המשתמשים.
+3. כעת, יופיע באנר "מצב עריכה פעיל" בראש המסך. 
+4. ניתן ללחוץ על כפתור העיפרון (✎) ליד כל מושג או תחום כדי לערוך אותו ישירות.
+5. לניהול מתקדם של נתונים, עיצוב וגיבויים, יש להיכנס למרכז הניהול תחת "הגדרות מתקדמות".
+כדי לצאת ממצב עריכה, לחצו על "יציאה ממצב עריכה" בבאנר העליון.
 ניהול מושגים
-- ליצור מושג חדש; הקוד נוצר אוטומטית לפי קידומת התחום.
-- לערוך מושג קיים.
+- ליצור מושג חדש דרך מרכז הניהול (הקוד נוצר אוטומטית לפי קידומת התחום).
+- לערוך מושג קיים באמצעות כפתור העריכה החזותי שלידו.
 - לשייך מושג ישירות לתחום, לתת-תחום או לתת-תת-תחום.
 - לערוך הגדרה עשירה עם כותרות, הדגשה, רשימות וציטוט.
-- להזין סימון, יחידות, תקציר, חשיבות, שמות חלופיים, תגיות ותקנים.
-- להזין נוסחה, משתנים ודוגמה מחושבת.
-- להזין שימושים, דגשים, שיקולי ייצור ושיטות בחינה.
 - לקשר מושגים קשורים לפי קוד או שם.
-- לציין שם קובץ תמונה מתיקיית images.
-- להטמיע תמונה קטנה בתוך המושג והגיבוי, עד המגבלה המוצגת בממשק.
-- לשכפל מושג. המערכת יוצרת קוד ייחודי גם בשכפול חוזר.
-- למחוק מושג לאחר אישור. המערכת שומרת נקודת שחזור ומנקה הפניות שבורות.
-- לחפש ולסנן את רשימת המושגים במרכז הניהול.
+- לציין שם קובץ תמונה מתיקיית images (ראו סעיף צירוף תמונות).
 ניהול תחומים והיררכיה
-- ליצור ולערוך תחום.
+- ליצור ולערוך תחום במרכז הניהול.
 - לקבוע שם, שם באנגלית, קידומת קוד, סמל, צבע ותיאור.
 - ליצור תתי-תחומים ותתי-תתי-תחומים.
-- למחוק תחום ריק.
-- למחוק תחום וכל תוכנו לאחר אישור מפורש ונקודת שחזור.
-גיבוי בהרשאת תוכן
-- כפתור הגיבוי העליון מוריד גיבוי תוכן.
-- גיבוי התוכן כולל תחומים, היררכיה, מושגים ותמונות שהוטמעו בתוך המושגים.
-- הוא אינו כולל קודי גישה, תמונות חיצוניות מתיקיית images או הגדרות UI/UX מלאות.
-מומחה תוכן אינו מקבל גישה ללשוניות "תצוגה" ו"גיבוי ותחזוקה" של האדמין הראשי.
-אדמין ראשי — Super Admin
-------------------------
-האדמין הראשי כולל את כל יכולות מומחה התוכן ובנוסף:
-תצוגה ו-UI/UX
+- למחוק תחום וכל תוכנו.
+תצוגה ו-UI/UX (מתקדם)
 - שינוי צבע ראשי, צבע רקע וצבע משטח.
 - שינוי משפחת גופן, גודל בסיס, עיגול פינות וצפיפות כרטיסים.
 - בחירת שדות שיוצגו למשתמשים.
 - איפוס הגדרות העיצוב לברירת המחדל.
 גיבוי ותחזוקה
-- הורדת גיבוי תוכן.
-- הורדת גיבוי אדמין ראשי מלא.
+- הורדת גיבוי תוכן או גיבוי אדמין ראשי מלא.
 - שחזור מגיבוי JSON קיים לאחר בדיקת מבנה ושלמות.
 - ייצוא CSV לבקרת תוכן ב-Excel. CSV אינו גיבוי מלא ואינו מיועד לשחזור.
-- בדיקת מצב האחסון המקומי.
-- בדיקת שלמות הקטלוג ותיקון כשלים אפשריים.
+- בדיקת מצב האחסון המקומי, תקינות הקטלוג ותיקון כשלים אפשריים.
 - שחזור נקודת השחזור המקומית האחרונה.
-- צפייה במצב הגיבויים ובשאלה האם יש שינויים שטרם הורדו לקובץ.
-- שינוי קוד מומחה התוכן וקוד האדמין הראשי.
-- שחזור קטלוג הבסיס המובנה.
-- איפוס התקדמות ומועדפים.
-- איפוס מלא לברירת המחדל, לאחר אישור כפול.
+- שחזור קטלוג הבסיס המובנה, איפוס התקדמות ומועדפים, או איפוס מלא.
 שמירה מקומית ושכבות זיכרון
 --------------------------
 כאשר המילון מופעל דרך START_MECHLEX.bat, IndexedDB הוא מאגר המצב המלא הראשי.

</xml_diff>